<commit_message>
Integrate AI intelligence directly into the operator console
Update diagram and documentation to embed AI functionality within the OCC, enabling real-time insights for operators.

Replit-Commit-Author: Agent
Replit-Commit-Session-Id: 0cbe7a84-a7a6-4a51-b09c-2be09cbda9ee
Replit-Commit-Checkpoint-Type: full_checkpoint
Replit-Commit-Event-Id: b68fca52-b1e2-4617-b550-5f4f483cb120
Replit-Commit-Screenshot-Url: https://storage.googleapis.com/screenshot-production-us-central1/1f99a8d9-3543-48bc-8564-b0463564e29d/0cbe7a84-a7a6-4a51-b09c-2be09cbda9ee/j0UkpbJ
</commit_message>
<xml_diff>
--- a/public/CuraLive_Platform_Architecture.docx
+++ b/public/CuraLive_Platform_Architecture.docx
@@ -346,6 +346,80 @@
     </w:tbl>
     <w:p>
       <w:pPr>
+        <w:spacing w:after="0" w:before="40"/>
+      </w:pPr>
+    </w:p>
+    <w:tbl>
+      <w:tblPr>
+        <w:tblW w:type="dxa" w:w="9000"/>
+        <w:tblBorders>
+          <w:top w:val="none" w:color="FFFFFF" w:sz="0"/>
+          <w:left w:val="none" w:color="FFFFFF" w:sz="0"/>
+          <w:bottom w:val="none" w:color="FFFFFF" w:sz="0"/>
+          <w:right w:val="none" w:color="FFFFFF" w:sz="0"/>
+          <w:insideH w:val="single" w:color="auto" w:sz="4"/>
+          <w:insideV w:val="single" w:color="auto" w:sz="4"/>
+        </w:tblBorders>
+      </w:tblPr>
+      <w:tblGrid>
+        <w:gridCol w:w="100"/>
+      </w:tblGrid>
+      <w:tr>
+        <w:tc>
+          <w:tcPr>
+            <w:tcW w:type="dxa" w:w="9000"/>
+            <w:tcBorders>
+              <w:top w:val="none" w:color="FFFFFF" w:sz="0"/>
+              <w:left w:val="none" w:color="FFFFFF" w:sz="0"/>
+              <w:bottom w:val="none" w:color="FFFFFF" w:sz="0"/>
+              <w:right w:val="none" w:color="FFFFFF" w:sz="0"/>
+            </w:tcBorders>
+            <w:shd w:color="1B4332" w:val="solid"/>
+            <w:tcMar>
+              <w:top w:type="dxa" w:w="160"/>
+              <w:left w:type="dxa" w:w="260"/>
+              <w:bottom w:type="dxa" w:w="160"/>
+              <w:right w:type="dxa" w:w="260"/>
+            </w:tcMar>
+            <w:vAlign w:val="center"/>
+          </w:tcPr>
+          <w:p>
+            <w:pPr>
+              <w:spacing w:after="0" w:before="0"/>
+              <w:jc w:val="center"/>
+            </w:pPr>
+            <w:r>
+              <w:rPr>
+                <w:b/>
+                <w:bCs/>
+                <w:color w:val="FFFFFF"/>
+                <w:sz w:val="24"/>
+                <w:szCs w:val="24"/>
+              </w:rPr>
+              <w:t xml:space="preserve">🤖   AI Intelligence  —  embedded within OCC</w:t>
+            </w:r>
+          </w:p>
+          <w:p>
+            <w:pPr>
+              <w:spacing w:after="0" w:before="40"/>
+              <w:jc w:val="center"/>
+            </w:pPr>
+            <w:r>
+              <w:rPr>
+                <w:b w:val="false"/>
+                <w:bCs w:val="false"/>
+                <w:color w:val="FFFFFF"/>
+                <w:sz w:val="19"/>
+                <w:szCs w:val="19"/>
+              </w:rPr>
+              <w:t xml:space="preserve">Live transcription  ·  Sentiment scoring  ·  Compliance flags  —  all visible to the operator in real time</w:t>
+            </w:r>
+          </w:p>
+        </w:tc>
+      </w:tr>
+    </w:tbl>
+    <w:p>
+      <w:pPr>
         <w:spacing w:after="60" w:before="60"/>
         <w:jc w:val="center"/>
       </w:pPr>
@@ -602,91 +676,6 @@
                 <w:szCs w:val="17"/>
               </w:rPr>
               <w:t xml:space="preserve">direct to their phone</w:t>
-            </w:r>
-          </w:p>
-        </w:tc>
-      </w:tr>
-    </w:tbl>
-    <w:p>
-      <w:pPr>
-        <w:spacing w:after="60" w:before="60"/>
-        <w:jc w:val="center"/>
-      </w:pPr>
-      <w:r>
-        <w:rPr>
-          <w:b/>
-          <w:bCs/>
-          <w:color w:val="6B7280"/>
-          <w:sz w:val="28"/>
-          <w:szCs w:val="28"/>
-        </w:rPr>
-        <w:t xml:space="preserve">↓</w:t>
-      </w:r>
-    </w:p>
-    <w:tbl>
-      <w:tblPr>
-        <w:tblW w:type="dxa" w:w="9000"/>
-        <w:tblBorders>
-          <w:top w:val="none" w:color="FFFFFF" w:sz="0"/>
-          <w:left w:val="none" w:color="FFFFFF" w:sz="0"/>
-          <w:bottom w:val="none" w:color="FFFFFF" w:sz="0"/>
-          <w:right w:val="none" w:color="FFFFFF" w:sz="0"/>
-          <w:insideH w:val="single" w:color="auto" w:sz="4"/>
-          <w:insideV w:val="single" w:color="auto" w:sz="4"/>
-        </w:tblBorders>
-      </w:tblPr>
-      <w:tblGrid>
-        <w:gridCol w:w="100"/>
-      </w:tblGrid>
-      <w:tr>
-        <w:tc>
-          <w:tcPr>
-            <w:tcW w:type="dxa" w:w="9000"/>
-            <w:tcBorders>
-              <w:top w:val="none" w:color="FFFFFF" w:sz="0"/>
-              <w:left w:val="none" w:color="FFFFFF" w:sz="0"/>
-              <w:bottom w:val="none" w:color="FFFFFF" w:sz="0"/>
-              <w:right w:val="none" w:color="FFFFFF" w:sz="0"/>
-            </w:tcBorders>
-            <w:shd w:color="4C1D95" w:val="solid"/>
-            <w:tcMar>
-              <w:top w:type="dxa" w:w="160"/>
-              <w:left w:type="dxa" w:w="260"/>
-              <w:bottom w:type="dxa" w:w="160"/>
-              <w:right w:type="dxa" w:w="260"/>
-            </w:tcMar>
-            <w:vAlign w:val="center"/>
-          </w:tcPr>
-          <w:p>
-            <w:pPr>
-              <w:spacing w:after="0" w:before="0"/>
-              <w:jc w:val="center"/>
-            </w:pPr>
-            <w:r>
-              <w:rPr>
-                <w:b/>
-                <w:bCs/>
-                <w:color w:val="FFFFFF"/>
-                <w:sz w:val="24"/>
-                <w:szCs w:val="24"/>
-              </w:rPr>
-              <w:t xml:space="preserve">🤖   AI Intelligence Layer</w:t>
-            </w:r>
-          </w:p>
-          <w:p>
-            <w:pPr>
-              <w:spacing w:after="0" w:before="40"/>
-              <w:jc w:val="center"/>
-            </w:pPr>
-            <w:r>
-              <w:rPr>
-                <w:b w:val="false"/>
-                <w:bCs w:val="false"/>
-                <w:color w:val="FFFFFF"/>
-                <w:sz w:val="19"/>
-                <w:szCs w:val="19"/>
-              </w:rPr>
-              <w:t xml:space="preserve">Transcription  ·  Sentiment scoring  ·  Compliance monitoring</w:t>
             </w:r>
           </w:p>
         </w:tc>

</xml_diff>